<commit_message>
docs: corrige acentuacao dos documentos
</commit_message>
<xml_diff>
--- a/exports/tootz/declaracao-adelino-segundo.docx
+++ b/exports/tootz/declaracao-adelino-segundo.docx
@@ -2,13 +2,13 @@
 <file path=word/document.xml><?xml version="1.0" encoding="utf-8"?>
 <w:document xmlns:w="http://schemas.openxmlformats.org/wordprocessingml/2006/main" xmlns:m="http://schemas.openxmlformats.org/officeDocument/2006/math" xmlns:r="http://schemas.openxmlformats.org/officeDocument/2006/relationships" xmlns:o="urn:schemas-microsoft-com:office:office" xmlns:v="urn:schemas-microsoft-com:vml" xmlns:w10="urn:schemas-microsoft-com:office:word" xmlns:a="http://schemas.openxmlformats.org/drawingml/2006/main" xmlns:pic="http://schemas.openxmlformats.org/drawingml/2006/picture" xmlns:wp="http://schemas.openxmlformats.org/drawingml/2006/wordprocessingDrawing">
   <w:body>
-    <w:bookmarkStart w:id="13" w:name="declaracao-tecnica---adelino-segundo"/>
+    <w:bookmarkStart w:id="13" w:name="declaração-técnica---adelino-segundo"/>
     <w:p>
       <w:pPr>
         <w:pStyle w:val="Heading1"/>
       </w:pPr>
       <w:r>
-        <w:t xml:space="preserve">Declaracao Tecnica - Adelino Segundo</w:t>
+        <w:t xml:space="preserve">Declaração Técnica - Adelino Segundo</w:t>
       </w:r>
     </w:p>
     <w:p>
@@ -29,10 +29,10 @@
         <w:rPr>
           <w:rStyle w:val="VerbatimChar"/>
         </w:rPr>
-        <w:t xml:space="preserve">TOOTZ SOLUCOES TECNOLOGICA LTDA - ME</w:t>
-      </w:r>
-      <w:r>
-        <w:t xml:space="preserve">, pessoa juridica de direito privado, inscrita no CNPJ sob o no</w:t>
+        <w:t xml:space="preserve">TOOTZ SOLUÇÕES TECNOLÓGICA LTDA - ME</w:t>
+      </w:r>
+      <w:r>
+        <w:t xml:space="preserve">, pessoa jurídica de direito privado, inscrita no CNPJ sob o nº</w:t>
       </w:r>
       <w:r>
         <w:t xml:space="preserve"> </w:t>
@@ -44,7 +44,7 @@
         <w:t xml:space="preserve">11.974.262/0001-73</w:t>
       </w:r>
       <w:r>
-        <w:t xml:space="preserve">, com sede na Cidade de Natal, Estado do Rio Grande do Norte, na Av. Eng Roberto Freire,</w:t>
+        <w:t xml:space="preserve">, com sede na Cidade de Natal, Estado do Rio Grande do Norte, na Av. Eng. Roberto Freire,</w:t>
       </w:r>
       <w:r>
         <w:t xml:space="preserve"> </w:t>
@@ -92,7 +92,7 @@
         <w:t xml:space="preserve">atendimento@tootz.com.br</w:t>
       </w:r>
       <w:r>
-        <w:t xml:space="preserve">, neste ato representada por seu Socio Diretor,</w:t>
+        <w:t xml:space="preserve">, neste ato representada por seu Sócio Diretor,</w:t>
       </w:r>
       <w:r>
         <w:t xml:space="preserve"> </w:t>
@@ -104,7 +104,7 @@
         <w:t xml:space="preserve">Adelino Neto Segundo</w:t>
       </w:r>
       <w:r>
-        <w:t xml:space="preserve">, brasileiro, solteiro, portador da Cedula de Identidade RG no</w:t>
+        <w:t xml:space="preserve">, brasileiro, solteiro, portador da Cédula de Identidade RG nº</w:t>
       </w:r>
       <w:r>
         <w:t xml:space="preserve"> </w:t>
@@ -116,7 +116,7 @@
         <w:t xml:space="preserve">002.093.165</w:t>
       </w:r>
       <w:r>
-        <w:t xml:space="preserve">, expedida pela SSP/RN, inscrito no CPF/MF sob o no</w:t>
+        <w:t xml:space="preserve">, expedida pela SSP/RN, inscrito no CPF/MF sob o nº</w:t>
       </w:r>
       <w:r>
         <w:t xml:space="preserve"> </w:t>
@@ -148,16 +148,16 @@
         <w:pStyle w:val="BodyText"/>
       </w:pPr>
       <w:r>
-        <w:t xml:space="preserve">Declaramos, para fins de comprovacao tecnica junto ao Sebrae/RJ no ambito do</w:t>
-      </w:r>
-      <w:r>
-        <w:t xml:space="preserve"> </w:t>
-      </w:r>
-      <w:r>
-        <w:rPr>
-          <w:rStyle w:val="VerbatimChar"/>
-        </w:rPr>
-        <w:t xml:space="preserve">Lote 3 - Solucoes Educacionais</w:t>
+        <w:t xml:space="preserve">Declaramos, para fins de comprovação técnica junto ao Sebrae/RJ no âmbito do</w:t>
+      </w:r>
+      <w:r>
+        <w:t xml:space="preserve"> </w:t>
+      </w:r>
+      <w:r>
+        <w:rPr>
+          <w:rStyle w:val="VerbatimChar"/>
+        </w:rPr>
+        <w:t xml:space="preserve">Lote 3 - Soluções Educacionais</w:t>
       </w:r>
       <w:r>
         <w:t xml:space="preserve">, que o profissional</w:t>
@@ -175,7 +175,7 @@
         <w:t xml:space="preserve"> </w:t>
       </w:r>
       <w:r>
-        <w:t xml:space="preserve">integra a equipe disponibilizada pela TOOTZ para atuacao junto a</w:t>
+        <w:t xml:space="preserve">integra a equipe disponibilizada pela TOOTZ para atuação junto à</w:t>
       </w:r>
       <w:r>
         <w:t xml:space="preserve"> </w:t>
@@ -187,28 +187,28 @@
         <w:t xml:space="preserve">GAME MIND STUDIOS LTDA.</w:t>
       </w:r>
       <w:r>
-        <w:t xml:space="preserve">, na funcao de</w:t>
-      </w:r>
-      <w:r>
-        <w:t xml:space="preserve"> </w:t>
-      </w:r>
-      <w:r>
-        <w:rPr>
-          <w:rStyle w:val="VerbatimChar"/>
-        </w:rPr>
-        <w:t xml:space="preserve">Lider de Desenvolvimento Back-end</w:t>
+        <w:t xml:space="preserve">, na função de</w:t>
+      </w:r>
+      <w:r>
+        <w:t xml:space="preserve"> </w:t>
+      </w:r>
+      <w:r>
+        <w:rPr>
+          <w:rStyle w:val="VerbatimChar"/>
+        </w:rPr>
+        <w:t xml:space="preserve">Líder de Desenvolvimento Back-end</w:t>
       </w:r>
       <w:r>
         <w:t xml:space="preserve">.</w:t>
       </w:r>
     </w:p>
-    <w:bookmarkStart w:id="9" w:name="vinculo-ao-escopo"/>
+    <w:bookmarkStart w:id="9" w:name="vínculo-ao-escopo"/>
     <w:p>
       <w:pPr>
         <w:pStyle w:val="Heading2"/>
       </w:pPr>
       <w:r>
-        <w:t xml:space="preserve">1. Vinculo ao escopo</w:t>
+        <w:t xml:space="preserve">1. Vínculo ao escopo</w:t>
       </w:r>
     </w:p>
     <w:p>
@@ -216,7 +216,7 @@
         <w:pStyle w:val="FirstParagraph"/>
       </w:pPr>
       <w:r>
-        <w:t xml:space="preserve">O profissional acima encontra-se vinculado a execucao do escopo contratado por meio do instrumento firmado entre</w:t>
+        <w:t xml:space="preserve">O profissional acima encontra-se vinculado à execução do escopo contratado por meio do instrumento firmado entre</w:t>
       </w:r>
       <w:r>
         <w:t xml:space="preserve"> </w:t>
@@ -247,13 +247,13 @@
       </w:r>
     </w:p>
     <w:bookmarkEnd w:id="9"/>
-    <w:bookmarkStart w:id="10" w:name="experiencia-aderente-ao-edital"/>
+    <w:bookmarkStart w:id="10" w:name="experiência-aderente-ao-edital"/>
     <w:p>
       <w:pPr>
         <w:pStyle w:val="Heading2"/>
       </w:pPr>
       <w:r>
-        <w:t xml:space="preserve">2. Experiencia aderente ao edital</w:t>
+        <w:t xml:space="preserve">2. Experiência aderente ao edital</w:t>
       </w:r>
     </w:p>
     <w:p>
@@ -261,7 +261,7 @@
         <w:pStyle w:val="FirstParagraph"/>
       </w:pPr>
       <w:r>
-        <w:t xml:space="preserve">Adelino Segundo possui experiencia em:</w:t>
+        <w:t xml:space="preserve">Adelino Segundo possui experiência em:</w:t>
       </w:r>
     </w:p>
     <w:p>
@@ -360,7 +360,7 @@
         </w:numPr>
       </w:pPr>
       <w:r>
-        <w:t xml:space="preserve">integracao de APIs;</w:t>
+        <w:t xml:space="preserve">integração de APIs;</w:t>
       </w:r>
     </w:p>
     <w:p>
@@ -372,17 +372,17 @@
         </w:numPr>
       </w:pPr>
       <w:r>
-        <w:t xml:space="preserve">seguranca do sistema e boas praticas de autenticacao, autorizacao e protecao de dados.</w:t>
+        <w:t xml:space="preserve">segurança do sistema e boas práticas de autenticação, autorização e proteção de dados.</w:t>
       </w:r>
     </w:p>
     <w:bookmarkEnd w:id="10"/>
-    <w:bookmarkStart w:id="11" w:name="lista-breve-de-projetos-de-referencia"/>
+    <w:bookmarkStart w:id="11" w:name="lista-breve-de-projetos-de-referência"/>
     <w:p>
       <w:pPr>
         <w:pStyle w:val="Heading2"/>
       </w:pPr>
       <w:r>
-        <w:t xml:space="preserve">3. Lista breve de projetos de referencia</w:t>
+        <w:t xml:space="preserve">3. Lista breve de projetos de referência</w:t>
       </w:r>
     </w:p>
     <w:p>
@@ -403,7 +403,7 @@
         <w:t xml:space="preserve"> </w:t>
       </w:r>
       <w:r>
-        <w:t xml:space="preserve">(inicio em</w:t>
+        <w:t xml:space="preserve">(início em</w:t>
       </w:r>
       <w:r>
         <w:t xml:space="preserve"> </w:t>
@@ -415,7 +415,7 @@
         <w:t xml:space="preserve">2016</w:t>
       </w:r>
       <w:r>
-        <w:t xml:space="preserve">, vigente ate a presente data)</w:t>
+        <w:t xml:space="preserve">, vigente até a presente data)</w:t>
       </w:r>
     </w:p>
     <w:p>
@@ -436,7 +436,7 @@
         <w:t xml:space="preserve"> </w:t>
       </w:r>
       <w:r>
-        <w:t xml:space="preserve">(inicio em</w:t>
+        <w:t xml:space="preserve">(início em</w:t>
       </w:r>
       <w:r>
         <w:t xml:space="preserve"> </w:t>
@@ -448,7 +448,7 @@
         <w:t xml:space="preserve">2024</w:t>
       </w:r>
       <w:r>
-        <w:t xml:space="preserve">, vigente ate a presente data)</w:t>
+        <w:t xml:space="preserve">, vigente até a presente data)</w:t>
       </w:r>
     </w:p>
     <w:p>
@@ -469,7 +469,7 @@
         <w:t xml:space="preserve"> </w:t>
       </w:r>
       <w:r>
-        <w:t xml:space="preserve">(inicio em</w:t>
+        <w:t xml:space="preserve">(início em</w:t>
       </w:r>
       <w:r>
         <w:t xml:space="preserve"> </w:t>
@@ -481,7 +481,7 @@
         <w:t xml:space="preserve">2020</w:t>
       </w:r>
       <w:r>
-        <w:t xml:space="preserve">, vigente ate a presente data)</w:t>
+        <w:t xml:space="preserve">, vigente até a presente data)</w:t>
       </w:r>
     </w:p>
     <w:p>
@@ -502,7 +502,7 @@
         <w:t xml:space="preserve"> </w:t>
       </w:r>
       <w:r>
-        <w:t xml:space="preserve">(inicio em</w:t>
+        <w:t xml:space="preserve">(início em</w:t>
       </w:r>
       <w:r>
         <w:t xml:space="preserve"> </w:t>
@@ -514,7 +514,7 @@
         <w:t xml:space="preserve">2021</w:t>
       </w:r>
       <w:r>
-        <w:t xml:space="preserve">, vigente ate a presente data)</w:t>
+        <w:t xml:space="preserve">, vigente até a presente data)</w:t>
       </w:r>
     </w:p>
     <w:p>
@@ -535,7 +535,7 @@
         <w:t xml:space="preserve"> </w:t>
       </w:r>
       <w:r>
-        <w:t xml:space="preserve">(inicio em</w:t>
+        <w:t xml:space="preserve">(início em</w:t>
       </w:r>
       <w:r>
         <w:t xml:space="preserve"> </w:t>
@@ -547,7 +547,7 @@
         <w:t xml:space="preserve">2022</w:t>
       </w:r>
       <w:r>
-        <w:t xml:space="preserve">, vigente ate a presente data)</w:t>
+        <w:t xml:space="preserve">, vigente até a presente data)</w:t>
       </w:r>
     </w:p>
     <w:p>
@@ -568,7 +568,7 @@
         <w:t xml:space="preserve"> </w:t>
       </w:r>
       <w:r>
-        <w:t xml:space="preserve">(inicio em</w:t>
+        <w:t xml:space="preserve">(início em</w:t>
       </w:r>
       <w:r>
         <w:t xml:space="preserve"> </w:t>
@@ -580,7 +580,7 @@
         <w:t xml:space="preserve">2022</w:t>
       </w:r>
       <w:r>
-        <w:t xml:space="preserve">, vigente ate a presente data)</w:t>
+        <w:t xml:space="preserve">, vigente até a presente data)</w:t>
       </w:r>
     </w:p>
     <w:p>
@@ -601,7 +601,7 @@
         <w:t xml:space="preserve"> </w:t>
       </w:r>
       <w:r>
-        <w:t xml:space="preserve">(inicio em</w:t>
+        <w:t xml:space="preserve">(início em</w:t>
       </w:r>
       <w:r>
         <w:t xml:space="preserve"> </w:t>
@@ -613,17 +613,17 @@
         <w:t xml:space="preserve">2020</w:t>
       </w:r>
       <w:r>
-        <w:t xml:space="preserve">, vigente ate a presente data)</w:t>
+        <w:t xml:space="preserve">, vigente até a presente data)</w:t>
       </w:r>
     </w:p>
     <w:bookmarkEnd w:id="11"/>
-    <w:bookmarkStart w:id="12" w:name="periodo-de-atuacao"/>
+    <w:bookmarkStart w:id="12" w:name="período-de-atuação"/>
     <w:p>
       <w:pPr>
         <w:pStyle w:val="Heading2"/>
       </w:pPr>
       <w:r>
-        <w:t xml:space="preserve">4. Periodo de atuacao</w:t>
+        <w:t xml:space="preserve">4. Período de atuação</w:t>
       </w:r>
     </w:p>
     <w:p>
@@ -635,7 +635,7 @@
         </w:numPr>
       </w:pPr>
       <w:r>
-        <w:t xml:space="preserve">Inicio do vinculo/projeto:</w:t>
+        <w:t xml:space="preserve">Início do vínculo/projeto:</w:t>
       </w:r>
       <w:r>
         <w:t xml:space="preserve"> </w:t>
@@ -656,16 +656,16 @@
         </w:numPr>
       </w:pPr>
       <w:r>
-        <w:t xml:space="preserve">Periodo de referencia da experiencia apresentada:</w:t>
-      </w:r>
-      <w:r>
-        <w:t xml:space="preserve"> </w:t>
-      </w:r>
-      <w:r>
-        <w:rPr>
-          <w:rStyle w:val="VerbatimChar"/>
-        </w:rPr>
-        <w:t xml:space="preserve">de 2016 ate a presente data</w:t>
+        <w:t xml:space="preserve">Período de referência da experiência apresentada:</w:t>
+      </w:r>
+      <w:r>
+        <w:t xml:space="preserve"> </w:t>
+      </w:r>
+      <w:r>
+        <w:rPr>
+          <w:rStyle w:val="VerbatimChar"/>
+        </w:rPr>
+        <w:t xml:space="preserve">de 2016 até a presente data</w:t>
       </w:r>
     </w:p>
     <w:p>
@@ -673,7 +673,7 @@
         <w:pStyle w:val="FirstParagraph"/>
       </w:pPr>
       <w:r>
-        <w:t xml:space="preserve">Declaramos que as informacoes acima sao verdadeiras.</w:t>
+        <w:t xml:space="preserve">Declaramos que as informações acima são verdadeiras.</w:t>
       </w:r>
     </w:p>
     <w:p>
@@ -757,7 +757,7 @@
         <w:rPr>
           <w:rStyle w:val="VerbatimChar"/>
         </w:rPr>
-        <w:t xml:space="preserve">Socio Diretor</w:t>
+        <w:t xml:space="preserve">Sócio Diretor</w:t>
       </w:r>
     </w:p>
     <w:p>

</xml_diff>